<commit_message>
Reporte: completar las secciones de la Pregunta 2
Llena 2.2 a 2.5 de la pregunta de distribucion territorial, las lineas de Pregunta 2 en ingenieria de datos (4.2 a 4.5) y en tablero (5.1 a 5.5).
</commit_message>
<xml_diff>
--- a/Entregables/Reporte_Proyecto_1_Plantilla.docx
+++ b/Entregables/Reporte_Proyecto_1_Plantilla.docx
@@ -2368,7 +2368,7 @@
           <w:szCs w:val="18"/>
           <w:lang w:val="es-CO"/>
         </w:rPr>
-        <w:t>[Completar esta sección con información breve, cuantitativa y directamente relacionada con la pregunta.]</w:t>
+        <w:t>El punto de partida fueron los 25.605 contratos de INVIAS extraídos de SECOP II. La auditoría de las variables geográficas mostró que ninguna permite ubicar el contrato: «departamento», «ciudad» y «localizacion» traen el mismo valor (Bogotá) en el 100 % de los registros, y «direccion_de_ejecucion_del_contrato» está vacía en 25.602 de 25.605 filas. Lo que SECOP II publica es el domicilio de la entidad, no el lugar de ejecución. Por eso la pregunta se reformuló para medir la trazabilidad territorial en lugar de darla por supuesta. El territorio sí aparece, pero en el texto libre del objeto contractual, así que se construyó la variable «departamento_inferido» aplicando un diccionario de 33 entidades territoriales sobre el objeto normalizado, con precedencia por longitud de alias y tratamiento de topónimos ambiguos. El análisis se realizó sobre los 19.617 contratos con valor contratado válido.</w:t>
       </w:r>
     </w:p>
     <w:p>
@@ -2394,6 +2394,175 @@
     </w:p>
     <w:p>
       <w:pPr>
+        <w:numPr>
+          <w:ilvl w:val="0"/>
+          <w:numId w:val="10"/>
+        </w:numPr>
+        <w:spacing w:after="100" w:afterAutospacing="1" w:line="240" w:lineRule="auto"/>
+        <w:jc w:val="both"/>
+        <w:rPr>
+          <w:rFonts w:ascii="Cambria Math" w:eastAsia="Times New Roman" w:hAnsi="Cambria Math" w:cs="Times New Roman"/>
+          <w:sz w:val="18"/>
+          <w:szCs w:val="18"/>
+          <w:lang w:val="es-CO" w:eastAsia="es-ES_tradnl"/>
+        </w:rPr>
+      </w:pPr>
+      <w:r>
+        <w:rPr>
+          <w:rFonts w:ascii="Cambria Math" w:eastAsia="Times New Roman" w:hAnsi="Cambria Math" w:cs="Times New Roman"/>
+          <w:b/>
+          <w:bCs/>
+          <w:sz w:val="18"/>
+          <w:szCs w:val="18"/>
+          <w:lang w:val="es-CO" w:eastAsia="es-ES_tradnl"/>
+        </w:rPr>
+        <w:t>La cobertura en número de contratos y en dinero no coincide.</w:t>
+      </w:r>
+      <w:r>
+        <w:rPr>
+          <w:rFonts w:ascii="Cambria Math" w:eastAsia="Times New Roman" w:hAnsi="Cambria Math" w:cs="Times New Roman"/>
+          <w:b w:val="0"/>
+          <w:sz w:val="18"/>
+          <w:szCs w:val="18"/>
+          <w:lang w:val="es-CO" w:eastAsia="es-ES_tradnl"/>
+        </w:rPr>
+        <w:t xml:space="preserve"> El 40,9 % de los contratos tiene un departamento único identificable y el 2,3 % es multidepartamental; juntos concentran el 77,9 % del valor contratado. Los no territorializables son el 56,7 % de los registros pero solo el 22,1 % del valor.</w:t>
+      </w:r>
+    </w:p>
+    <w:p>
+      <w:pPr>
+        <w:numPr>
+          <w:ilvl w:val="0"/>
+          <w:numId w:val="10"/>
+        </w:numPr>
+        <w:spacing w:after="100" w:afterAutospacing="1" w:line="240" w:lineRule="auto"/>
+        <w:jc w:val="both"/>
+        <w:rPr>
+          <w:rFonts w:ascii="Cambria Math" w:eastAsia="Times New Roman" w:hAnsi="Cambria Math" w:cs="Times New Roman"/>
+          <w:sz w:val="18"/>
+          <w:szCs w:val="18"/>
+          <w:lang w:val="es-CO" w:eastAsia="es-ES_tradnl"/>
+        </w:rPr>
+      </w:pPr>
+      <w:r>
+        <w:rPr>
+          <w:rFonts w:ascii="Cambria Math" w:eastAsia="Times New Roman" w:hAnsi="Cambria Math" w:cs="Times New Roman"/>
+          <w:b/>
+          <w:bCs/>
+          <w:sz w:val="18"/>
+          <w:szCs w:val="18"/>
+          <w:lang w:val="es-CO" w:eastAsia="es-ES_tradnl"/>
+        </w:rPr>
+        <w:t>Lo que no se ubica es mucho y pequeño.</w:t>
+      </w:r>
+      <w:r>
+        <w:rPr>
+          <w:rFonts w:ascii="Cambria Math" w:eastAsia="Times New Roman" w:hAnsi="Cambria Math" w:cs="Times New Roman"/>
+          <w:b w:val="0"/>
+          <w:sz w:val="18"/>
+          <w:szCs w:val="18"/>
+          <w:lang w:val="es-CO" w:eastAsia="es-ES_tradnl"/>
+        </w:rPr>
+        <w:t xml:space="preserve"> El 84 % de los contratos sin departamento identificable son de prestación de servicios de la sede central. La prueba chi-cuadrado descarta que la falta de trazabilidad sea aleatoria: está asociada al tipo de contrato, con una V de Cramér de 0,645.</w:t>
+      </w:r>
+    </w:p>
+    <w:p>
+      <w:pPr>
+        <w:numPr>
+          <w:ilvl w:val="0"/>
+          <w:numId w:val="10"/>
+        </w:numPr>
+        <w:spacing w:after="100" w:afterAutospacing="1" w:line="240" w:lineRule="auto"/>
+        <w:jc w:val="both"/>
+        <w:rPr>
+          <w:rFonts w:ascii="Cambria Math" w:eastAsia="Times New Roman" w:hAnsi="Cambria Math" w:cs="Times New Roman"/>
+          <w:sz w:val="18"/>
+          <w:szCs w:val="18"/>
+          <w:lang w:val="es-CO" w:eastAsia="es-ES_tradnl"/>
+        </w:rPr>
+      </w:pPr>
+      <w:r>
+        <w:rPr>
+          <w:rFonts w:ascii="Cambria Math" w:eastAsia="Times New Roman" w:hAnsi="Cambria Math" w:cs="Times New Roman"/>
+          <w:b/>
+          <w:bCs/>
+          <w:sz w:val="18"/>
+          <w:szCs w:val="18"/>
+          <w:lang w:val="es-CO" w:eastAsia="es-ES_tradnl"/>
+        </w:rPr>
+        <w:t>Los recursos se dirigen a la periferia, no al centro económico.</w:t>
+      </w:r>
+      <w:r>
+        <w:rPr>
+          <w:rFonts w:ascii="Cambria Math" w:eastAsia="Times New Roman" w:hAnsi="Cambria Math" w:cs="Times New Roman"/>
+          <w:b w:val="0"/>
+          <w:sz w:val="18"/>
+          <w:szCs w:val="18"/>
+          <w:lang w:val="es-CO" w:eastAsia="es-ES_tradnl"/>
+        </w:rPr>
+        <w:t xml:space="preserve"> Antioquia (12,8 %), Nariño (10,7 %), Cauca (10,1 %), Putumayo (7,4 %) y Norte de Santander (6,5 %) encabezan el valor contratado, un patrón coherente con el mandato de INVIAS sobre la red vial no concesionada.</w:t>
+      </w:r>
+    </w:p>
+    <w:p>
+      <w:pPr>
+        <w:numPr>
+          <w:ilvl w:val="0"/>
+          <w:numId w:val="10"/>
+        </w:numPr>
+        <w:spacing w:after="100" w:afterAutospacing="1" w:line="240" w:lineRule="auto"/>
+        <w:jc w:val="both"/>
+        <w:rPr>
+          <w:rFonts w:ascii="Cambria Math" w:eastAsia="Times New Roman" w:hAnsi="Cambria Math" w:cs="Times New Roman"/>
+          <w:sz w:val="18"/>
+          <w:szCs w:val="18"/>
+          <w:lang w:val="es-CO" w:eastAsia="es-ES_tradnl"/>
+        </w:rPr>
+      </w:pPr>
+      <w:r>
+        <w:rPr>
+          <w:rFonts w:ascii="Cambria Math" w:eastAsia="Times New Roman" w:hAnsi="Cambria Math" w:cs="Times New Roman"/>
+          <w:b/>
+          <w:bCs/>
+          <w:sz w:val="18"/>
+          <w:szCs w:val="18"/>
+          <w:lang w:val="es-CO" w:eastAsia="es-ES_tradnl"/>
+        </w:rPr>
+        <w:t>La trazabilidad se deteriora en los últimos años.</w:t>
+      </w:r>
+      <w:r>
+        <w:rPr>
+          <w:rFonts w:ascii="Cambria Math" w:eastAsia="Times New Roman" w:hAnsi="Cambria Math" w:cs="Times New Roman"/>
+          <w:b w:val="0"/>
+          <w:sz w:val="18"/>
+          <w:szCs w:val="18"/>
+          <w:lang w:val="es-CO" w:eastAsia="es-ES_tradnl"/>
+        </w:rPr>
+        <w:t xml:space="preserve"> Entre 2018 y 2022 se mantuvo entre 85 % y 95 %; bajó a 76 % en 2023 y 2024, y a 46 % en 2025. El objeto contractual describe cada vez menos dónde se ejecuta el recurso.</w:t>
+      </w:r>
+    </w:p>
+    <w:p>
+      <w:pPr>
+        <w:pStyle w:val="Ttulo2"/>
+        <w:jc w:val="both"/>
+        <w:rPr>
+          <w:rFonts w:ascii="Cambria Math" w:hAnsi="Cambria Math"/>
+          <w:sz w:val="18"/>
+          <w:szCs w:val="18"/>
+          <w:lang w:val="es-CO"/>
+        </w:rPr>
+      </w:pPr>
+      <w:r>
+        <w:rPr>
+          <w:rFonts w:ascii="Cambria Math" w:hAnsi="Cambria Math"/>
+          <w:sz w:val="18"/>
+          <w:szCs w:val="18"/>
+          <w:lang w:val="es-CO"/>
+        </w:rPr>
+        <w:t>2.4 Respuesta a la pregunta de negocio</w:t>
+      </w:r>
+    </w:p>
+    <w:p>
+      <w:pPr>
         <w:spacing w:after="80"/>
         <w:jc w:val="both"/>
         <w:rPr>
@@ -2410,7 +2579,7 @@
           <w:szCs w:val="18"/>
           <w:lang w:val="es-CO"/>
         </w:rPr>
-        <w:t>[Completar esta sección con información breve, cuantitativa y directamente relacionada con la pregunta.]</w:t>
+        <w:t>La pregunta se responde en sus dos partes. Sobre la proporción identificable: el 43,2 % de los contratos puede ubicarse territorialmente y esos contratos representan el 77,9 % del valor. Sobre la distribución: los recursos se concentran en departamentos con red vial extensa y poco concesionada, y la cobertura territorial cae de forma sostenida desde 2023. La respuesta es parcial por construcción, y esa parcialidad es en sí misma un resultado: uno de cada cinco pesos contratados no es rastreable territorialmente a partir de lo que publica la fuente. La validación de una muestra de 60 contratos dio 58 asignaciones correctas, con una precisión estimada del 96,7 %.</w:t>
       </w:r>
     </w:p>
     <w:p>
@@ -2431,7 +2600,7 @@
           <w:szCs w:val="18"/>
           <w:lang w:val="es-CO"/>
         </w:rPr>
-        <w:t>2.4 Respuesta a la pregunta de negocio</w:t>
+        <w:t>2.5 Implicación para la toma de decisiones</w:t>
       </w:r>
     </w:p>
     <w:p>
@@ -2452,12 +2621,11 @@
           <w:szCs w:val="18"/>
           <w:lang w:val="es-CO"/>
         </w:rPr>
-        <w:t>[Completar esta sección con información breve, cuantitativa y directamente relacionada con la pregunta.]</w:t>
+        <w:t>Para la Dirección del INVIAS y los organismos de control quedan dos lecturas. La primera es el reparto de recursos por departamento y por año, con el detalle por tipo de contrato y modalidad. La segunda es la limitación de la fuente: registrar el lugar de ejecución como campo estructurado en SECOP II resolvería de raíz el 22,1 % del valor que hoy no se puede ubicar, y la caída de la trazabilidad desde 2023 es el argumento para exigirlo. Mientras eso no ocurra, cualquier lectura territorial de esta contratación debe presentarse junto con su nivel de cobertura, no como si abarcara el total.</w:t>
       </w:r>
     </w:p>
     <w:p>
       <w:pPr>
-        <w:pStyle w:val="Ttulo2"/>
         <w:jc w:val="both"/>
         <w:rPr>
           <w:rFonts w:ascii="Cambria Math" w:hAnsi="Cambria Math"/>
@@ -2469,53 +2637,12 @@
       <w:r>
         <w:rPr>
           <w:rFonts w:ascii="Cambria Math" w:hAnsi="Cambria Math"/>
-          <w:sz w:val="18"/>
-          <w:szCs w:val="18"/>
-          <w:lang w:val="es-CO"/>
-        </w:rPr>
-        <w:t>2.5 Implicación para la toma de decisiones</w:t>
-      </w:r>
-    </w:p>
-    <w:p>
-      <w:pPr>
-        <w:spacing w:after="80"/>
-        <w:jc w:val="both"/>
-        <w:rPr>
-          <w:rFonts w:ascii="Cambria Math" w:hAnsi="Cambria Math"/>
-          <w:sz w:val="18"/>
-          <w:szCs w:val="18"/>
-          <w:lang w:val="es-CO"/>
-        </w:rPr>
-      </w:pPr>
-      <w:r>
-        <w:rPr>
-          <w:rFonts w:ascii="Cambria Math" w:hAnsi="Cambria Math"/>
-          <w:sz w:val="18"/>
-          <w:szCs w:val="18"/>
-          <w:lang w:val="es-CO"/>
-        </w:rPr>
-        <w:t>[Completar esta sección con información breve, cuantitativa y directamente relacionada con la pregunta.]</w:t>
-      </w:r>
-    </w:p>
-    <w:p>
-      <w:pPr>
-        <w:jc w:val="both"/>
-        <w:rPr>
-          <w:rFonts w:ascii="Cambria Math" w:hAnsi="Cambria Math"/>
-          <w:sz w:val="18"/>
-          <w:szCs w:val="18"/>
-          <w:lang w:val="es-CO"/>
-        </w:rPr>
-      </w:pPr>
-      <w:r>
-        <w:rPr>
-          <w:rFonts w:ascii="Cambria Math" w:hAnsi="Cambria Math"/>
           <w:i/>
           <w:sz w:val="18"/>
           <w:szCs w:val="18"/>
           <w:lang w:val="es-CO"/>
         </w:rPr>
-        <w:t>Visualizaciones/evidencias: [Insertar máximo 1–2 elementos gráficos relevantes.]</w:t>
+        <w:t>Visualizaciones/evidencias: mapa coroplético del valor contratado por departamento y evolución anual de la cobertura territorial.</w:t>
       </w:r>
     </w:p>
     <w:p>
@@ -3898,6 +4025,16 @@
         </w:rPr>
         <w:t>Pregunta 2:</w:t>
       </w:r>
+      <w:r>
+        <w:rPr>
+          <w:rFonts w:ascii="Cambria Math" w:hAnsi="Cambria Math"/>
+          <w:b w:val="0"/>
+          <w:sz w:val="18"/>
+          <w:szCs w:val="18"/>
+          <w:lang w:val="es-CO"/>
+        </w:rPr>
+        <w:t xml:space="preserve"> Se normalizó el texto del objeto contractual y la descripción del proceso (mayúsculas, sin tildes, espacios colapsados) para poder buscar sobre él. Se descartaron las variables geográficas estructuradas tras comprobar que no registran el lugar de ejecución, y se documentó esa decisión en el cuaderno de auditoría en lugar de eliminarlas en silencio.</w:t>
+      </w:r>
     </w:p>
     <w:p>
       <w:pPr>
@@ -4016,6 +4153,16 @@
         </w:rPr>
         <w:t>Pregunta 2:</w:t>
       </w:r>
+      <w:r>
+        <w:rPr>
+          <w:rFonts w:ascii="Cambria Math" w:hAnsi="Cambria Math"/>
+          <w:b w:val="0"/>
+          <w:sz w:val="18"/>
+          <w:szCs w:val="18"/>
+          <w:lang w:val="es-CO"/>
+        </w:rPr>
+        <w:t xml:space="preserve"> Se construyó «departamento_inferido» con un diccionario de alias de los 32 departamentos y Bogotá. Los alias se evalúan de más largo a más corto y el fragmento emparejado se consume, porque de lo contrario «Norte de Santander» también activaba «Santander» y el contrato quedaba asignado a dos departamentos. Se enmascararon seis topónimos ambiguos (San Juan del Cesar, Magdalena Medio, Ciudad Bolívar y los municipios homónimos de Bolívar, Sucre y Córdoba): aparecían en 98 contratos y el tratamiento corrigió 80 asignaciones. Además se derivaron «trazabilidad_territorial», «n_departamentos», «direccion_territorial», «codigo_via» y «ruta_nacional».</w:t>
+      </w:r>
     </w:p>
     <w:p>
       <w:pPr>
@@ -4154,6 +4301,16 @@
         </w:rPr>
         <w:t>Pregunta 2:</w:t>
       </w:r>
+      <w:r>
+        <w:rPr>
+          <w:rFonts w:ascii="Cambria Math" w:hAnsi="Cambria Math"/>
+          <w:b w:val="0"/>
+          <w:sz w:val="18"/>
+          <w:szCs w:val="18"/>
+          <w:lang w:val="es-CO"/>
+        </w:rPr>
+        <w:t xml:space="preserve"> Se obtuvo una base analítica de 25.605 contratos con las variables territoriales construidas, más los agregados por departamento, año, tipo de contrato y modalidad que consume el tablero. La precisión de la extracción se estimó en 96,7 % sobre una muestra de 60 contratos revisados contra el texto del objeto (58 correctos, 2 dudosos).</w:t>
+      </w:r>
     </w:p>
     <w:p>
       <w:pPr>
@@ -4284,6 +4441,16 @@
           <w:lang w:val="es-CO"/>
         </w:rPr>
         <w:t>Pregunta 2:</w:t>
+      </w:r>
+      <w:r>
+        <w:rPr>
+          <w:rFonts w:ascii="Cambria Math" w:hAnsi="Cambria Math"/>
+          <w:b w:val="0"/>
+          <w:sz w:val="18"/>
+          <w:szCs w:val="18"/>
+          <w:lang w:val="es-CO"/>
+        </w:rPr>
+        <w:t xml:space="preserve"> Cuadernos «01_auditoria_territorial_p2.ipynb» (justificación del descarte de las variables geográficas) y «02_construccion_territorial_p2.ipynb» (construcción y validación), más los archivos «df_analitico_p2.csv», «agregado_departamento_p2.csv», «trazabilidad_anual_p2.csv» y «muestra_validacion_p2.csv» con la muestra de validación.</w:t>
       </w:r>
     </w:p>
     <w:p>
@@ -4612,6 +4779,16 @@
         </w:rPr>
         <w:t>Pregunta 2:</w:t>
       </w:r>
+      <w:r>
+        <w:rPr>
+          <w:rFonts w:ascii="Cambria Math" w:hAnsi="Cambria Math"/>
+          <w:b w:val="0"/>
+          <w:sz w:val="18"/>
+          <w:szCs w:val="18"/>
+          <w:lang w:val="es-CO"/>
+        </w:rPr>
+        <w:t xml:space="preserve"> Diseño orientado a responder dónde se ejecutan los recursos sin ocultar cuánto de eso es verificable. El indicador de cobertura territorial va en la fila superior de KPI y no en una nota al pie, porque un mapa que presenta el 77,9 % del valor como si fuera el total induce a error a quien decide.</w:t>
+      </w:r>
     </w:p>
     <w:p>
       <w:pPr>
@@ -4751,6 +4928,16 @@
         </w:rPr>
         <w:t>Pregunta 2:</w:t>
       </w:r>
+      <w:r>
+        <w:rPr>
+          <w:rFonts w:ascii="Cambria Math" w:hAnsi="Cambria Math"/>
+          <w:b w:val="0"/>
+          <w:sz w:val="18"/>
+          <w:szCs w:val="18"/>
+          <w:lang w:val="es-CO"/>
+        </w:rPr>
+        <w:t xml:space="preserve"> Módulo «territorial.py» con cuatro indicadores, filtros por rango de años, tipo de contrato y modalidad, mapa coroplético de Colombia, ranking de departamentos y dos series de tiempo. El mapa usa Choroplethmapbox sobre fondo plano en lugar de Choropleth, porque este último descarga la geometría desde un CDN externo y deja el mapa en blanco si la instancia no tiene salida a internet.</w:t>
+      </w:r>
     </w:p>
     <w:p>
       <w:pPr>
@@ -4890,6 +5077,16 @@
         </w:rPr>
         <w:t>Pregunta 2:</w:t>
       </w:r>
+      <w:r>
+        <w:rPr>
+          <w:rFonts w:ascii="Cambria Math" w:hAnsi="Cambria Math"/>
+          <w:b w:val="0"/>
+          <w:sz w:val="18"/>
+          <w:szCs w:val="18"/>
+          <w:lang w:val="es-CO"/>
+        </w:rPr>
+        <w:t xml:space="preserve"> Módulo de distribución y trazabilidad territorial. Se construyó además la aplicación contenedora «app.py», que registra las tres pestañas y permite que cada integrante trabaje sobre su módulo sin bloquear a los demás, y se integró el módulo de la Pregunta 3 a esa estructura.</w:t>
+      </w:r>
     </w:p>
     <w:p>
       <w:pPr>
@@ -5029,6 +5226,16 @@
         </w:rPr>
         <w:t>Pregunta 2:</w:t>
       </w:r>
+      <w:r>
+        <w:rPr>
+          <w:rFonts w:ascii="Cambria Math" w:hAnsi="Cambria Math"/>
+          <w:b w:val="0"/>
+          <w:sz w:val="18"/>
+          <w:szCs w:val="18"/>
+          <w:lang w:val="es-CO"/>
+        </w:rPr>
+        <w:t xml:space="preserve"> Se verificó que el tablero no realiza peticiones a servidores externos, requisito para que funcione en la instancia de EC2. Se corrigió una discrepancia entre el tablero y el informe: 2.374 contratos no tienen fecha de firma y el filtro de año los descartaba en silencio, lo que subía la cobertura de 77,9 % a 88,2 %. Ahora se incluyen por defecto mediante una casilla explícita.</w:t>
+      </w:r>
     </w:p>
     <w:p>
       <w:pPr>
@@ -5176,6 +5383,16 @@
           <w:lang w:val="es-CO"/>
         </w:rPr>
         <w:t>Pregunta 2:</w:t>
+      </w:r>
+      <w:r>
+        <w:rPr>
+          <w:rFonts w:ascii="Cambria Math" w:hAnsi="Cambria Math"/>
+          <w:b w:val="0"/>
+          <w:sz w:val="18"/>
+          <w:szCs w:val="18"/>
+          <w:lang w:val="es-CO"/>
+        </w:rPr>
+        <w:t xml:space="preserve"> Módulo que permite consultar la distribución territorial del gasto por departamento y año, junto con el nivel de trazabilidad de la información que se está consultando.</w:t>
       </w:r>
     </w:p>
     <w:p>

</xml_diff>

<commit_message>
Agregar las figuras de la Pregunta 2 al reporte y la presentacion
Inserta el mapa de valor contratado por departamento y la evolucion anual de la trazabilidad en la seccion 2 del reporte, y el mapa en la diapositiva 3. Se ajusto el texto de la seccion 2 para que quepa en una pagina.
</commit_message>
<xml_diff>
--- a/Entregables/Reporte_Proyecto_1_Plantilla.docx
+++ b/Entregables/Reporte_Proyecto_1_Plantilla.docx
@@ -2368,7 +2368,7 @@
           <w:szCs w:val="18"/>
           <w:lang w:val="es-CO"/>
         </w:rPr>
-        <w:t>El punto de partida fueron los 25.605 contratos de INVIAS extraídos de SECOP II. La auditoría de las variables geográficas mostró que ninguna permite ubicar el contrato: «departamento», «ciudad» y «localizacion» traen el mismo valor (Bogotá) en el 100 % de los registros, y «direccion_de_ejecucion_del_contrato» está vacía en 25.602 de 25.605 filas. Lo que SECOP II publica es el domicilio de la entidad, no el lugar de ejecución. Por eso la pregunta se reformuló para medir la trazabilidad territorial en lugar de darla por supuesta. El territorio sí aparece, pero en el texto libre del objeto contractual, así que se construyó la variable «departamento_inferido» aplicando un diccionario de 33 entidades territoriales sobre el objeto normalizado, con precedencia por longitud de alias y tratamiento de topónimos ambiguos. El análisis se realizó sobre los 19.617 contratos con valor contratado válido.</w:t>
+        <w:t>Se partió de los 25.605 contratos de INVIAS extraídos de SECOP II. Ninguna variable geográfica sirve para ubicarlos: «departamento», «ciudad» y «localizacion» traen Bogotá en el 100 % de los registros y «direccion_de_ejecucion_del_contrato» está vacía en 25.602 filas. SECOP II publica el domicilio de la entidad, no el lugar de ejecución. El territorio sí aparece, pero en el texto libre del objeto contractual, así que se construyó «departamento_inferido» con un diccionario de 33 entidades territoriales, precedencia por longitud de alias y tratamiento de topónimos ambiguos, sobre los 19.617 contratos con valor válido.</w:t>
       </w:r>
     </w:p>
     <w:p>
@@ -2426,7 +2426,7 @@
           <w:szCs w:val="18"/>
           <w:lang w:val="es-CO" w:eastAsia="es-ES_tradnl"/>
         </w:rPr>
-        <w:t xml:space="preserve"> El 40,9 % de los contratos tiene un departamento único identificable y el 2,3 % es multidepartamental; juntos concentran el 77,9 % del valor contratado. Los no territorializables son el 56,7 % de los registros pero solo el 22,1 % del valor.</w:t>
+        <w:t xml:space="preserve"> El 43,2 % de los contratos tiene departamento identificable (40,9 % único y 2,3 % multidepartamental) y concentra el 77,9 % del valor. Los no ubicables son el 56,7 % de los registros y el 22,1 % del dinero.</w:t>
       </w:r>
     </w:p>
     <w:p>
@@ -2463,7 +2463,7 @@
           <w:szCs w:val="18"/>
           <w:lang w:val="es-CO" w:eastAsia="es-ES_tradnl"/>
         </w:rPr>
-        <w:t xml:space="preserve"> El 84 % de los contratos sin departamento identificable son de prestación de servicios de la sede central. La prueba chi-cuadrado descarta que la falta de trazabilidad sea aleatoria: está asociada al tipo de contrato, con una V de Cramér de 0,645.</w:t>
+        <w:t xml:space="preserve"> El 84 % son prestación de servicios de la sede central. La prueba chi-cuadrado descarta que sea aleatorio: V de Cramér de 0,645.</w:t>
       </w:r>
     </w:p>
     <w:p>
@@ -2500,7 +2500,7 @@
           <w:szCs w:val="18"/>
           <w:lang w:val="es-CO" w:eastAsia="es-ES_tradnl"/>
         </w:rPr>
-        <w:t xml:space="preserve"> Antioquia (12,8 %), Nariño (10,7 %), Cauca (10,1 %), Putumayo (7,4 %) y Norte de Santander (6,5 %) encabezan el valor contratado, un patrón coherente con el mandato de INVIAS sobre la red vial no concesionada.</w:t>
+        <w:t xml:space="preserve"> Antioquia (12,8 %), Nariño (10,7 %), Cauca (10,1 %), Putumayo (7,4 %) y Norte de Santander (6,5 %), coherente con el mandato sobre la red vial no concesionada.</w:t>
       </w:r>
     </w:p>
     <w:p>
@@ -2537,7 +2537,7 @@
           <w:szCs w:val="18"/>
           <w:lang w:val="es-CO" w:eastAsia="es-ES_tradnl"/>
         </w:rPr>
-        <w:t xml:space="preserve"> Entre 2018 y 2022 se mantuvo entre 85 % y 95 %; bajó a 76 % en 2023 y 2024, y a 46 % en 2025. El objeto contractual describe cada vez menos dónde se ejecuta el recurso.</w:t>
+        <w:t xml:space="preserve"> De 85–95 % entre 2018 y 2022 pasó a 76 % en 2023–2024 y a 46 % en 2025.</w:t>
       </w:r>
     </w:p>
     <w:p>
@@ -2579,7 +2579,7 @@
           <w:szCs w:val="18"/>
           <w:lang w:val="es-CO"/>
         </w:rPr>
-        <w:t>La pregunta se responde en sus dos partes. Sobre la proporción identificable: el 43,2 % de los contratos puede ubicarse territorialmente y esos contratos representan el 77,9 % del valor. Sobre la distribución: los recursos se concentran en departamentos con red vial extensa y poco concesionada, y la cobertura territorial cae de forma sostenida desde 2023. La respuesta es parcial por construcción, y esa parcialidad es en sí misma un resultado: uno de cada cinco pesos contratados no es rastreable territorialmente a partir de lo que publica la fuente. La validación de una muestra de 60 contratos dio 58 asignaciones correctas, con una precisión estimada del 96,7 %.</w:t>
+        <w:t>La pregunta se responde en sus dos partes: el 43,2 % de los contratos es ubicable y representa el 77,9 % del valor, y esos recursos se concentran en departamentos con red vial extensa y poco concesionada. La parcialidad es en sí misma un resultado: uno de cada cinco pesos no es rastreable desde la fuente. La validación de una muestra de 60 contratos dio 58 correctas, con una precisión estimada del 96,7 %.</w:t>
       </w:r>
     </w:p>
     <w:p>
@@ -2621,7 +2621,7 @@
           <w:szCs w:val="18"/>
           <w:lang w:val="es-CO"/>
         </w:rPr>
-        <w:t>Para la Dirección del INVIAS y los organismos de control quedan dos lecturas. La primera es el reparto de recursos por departamento y por año, con el detalle por tipo de contrato y modalidad. La segunda es la limitación de la fuente: registrar el lugar de ejecución como campo estructurado en SECOP II resolvería de raíz el 22,1 % del valor que hoy no se puede ubicar, y la caída de la trazabilidad desde 2023 es el argumento para exigirlo. Mientras eso no ocurra, cualquier lectura territorial de esta contratación debe presentarse junto con su nivel de cobertura, no como si abarcara el total.</w:t>
+        <w:t>Quedan dos lecturas para la Dirección y los organismos de control: el reparto de recursos por departamento y año, y la limitación de la fuente. Registrar el lugar de ejecución como campo estructurado resolvería el 22,1 % del valor que hoy no se puede ubicar, y la caída de la trazabilidad desde 2023 es el argumento para exigirlo. Mientras tanto, toda lectura territorial debe presentarse junto con su nivel de cobertura.</w:t>
       </w:r>
     </w:p>
     <w:p>
@@ -2642,9 +2642,144 @@
           <w:szCs w:val="18"/>
           <w:lang w:val="es-CO"/>
         </w:rPr>
-        <w:t>Visualizaciones/evidencias: mapa coroplético del valor contratado por departamento y evolución anual de la cobertura territorial.</w:t>
+        <w:t>Visualizaciones/evidencias:</w:t>
       </w:r>
     </w:p>
+    <w:tbl>
+      <w:tblPr>
+        <w:tblW w:type="auto" w:w="0"/>
+        <w:tblLook w:firstColumn="1" w:firstRow="1" w:lastColumn="0" w:lastRow="0" w:noHBand="0" w:noVBand="1" w:val="04A0"/>
+        <w:jc w:val="center"/>
+        <w:tblBorders>
+          <w:top w:val="none" w:sz="0"/>
+          <w:left w:val="none" w:sz="0"/>
+          <w:bottom w:val="none" w:sz="0"/>
+          <w:right w:val="none" w:sz="0"/>
+          <w:insideH w:val="none" w:sz="0"/>
+          <w:insideV w:val="none" w:sz="0"/>
+        </w:tblBorders>
+      </w:tblPr>
+      <w:tblGrid>
+        <w:gridCol w:w="3402"/>
+        <w:gridCol w:w="5953"/>
+      </w:tblGrid>
+      <w:tr>
+        <w:tc>
+          <w:tcPr>
+            <w:tcW w:type="dxa" w:w="3402"/>
+          </w:tcPr>
+          <w:p>
+            <w:pPr>
+              <w:jc w:val="center"/>
+            </w:pPr>
+            <w:r>
+              <w:drawing>
+                <wp:inline xmlns:a="http://schemas.openxmlformats.org/drawingml/2006/main" xmlns:pic="http://schemas.openxmlformats.org/drawingml/2006/picture">
+                  <wp:extent cx="1296000" cy="1752597"/>
+                  <wp:docPr id="34738623" name="Picture 34738623"/>
+                  <wp:cNvGraphicFramePr>
+                    <a:graphicFrameLocks noChangeAspect="1"/>
+                  </wp:cNvGraphicFramePr>
+                  <a:graphic>
+                    <a:graphicData uri="http://schemas.openxmlformats.org/drawingml/2006/picture">
+                      <pic:pic>
+                        <pic:nvPicPr>
+                          <pic:cNvPr id="0" name="fig06_cell29.png"/>
+                          <pic:cNvPicPr/>
+                        </pic:nvPicPr>
+                        <pic:blipFill>
+                          <a:blip r:embed="rId12"/>
+                          <a:stretch>
+                            <a:fillRect/>
+                          </a:stretch>
+                        </pic:blipFill>
+                        <pic:spPr>
+                          <a:xfrm>
+                            <a:off x="0" y="0"/>
+                            <a:ext cx="1296000" cy="1752597"/>
+                          </a:xfrm>
+                          <a:prstGeom prst="rect"/>
+                        </pic:spPr>
+                      </pic:pic>
+                    </a:graphicData>
+                  </a:graphic>
+                </wp:inline>
+              </w:drawing>
+            </w:r>
+          </w:p>
+          <w:p>
+            <w:pPr>
+              <w:jc w:val="center"/>
+            </w:pPr>
+            <w:r>
+              <w:rPr>
+                <w:rFonts w:ascii="Cambria Math" w:hAnsi="Cambria Math"/>
+                <w:i/>
+                <w:sz w:val="18"/>
+              </w:rPr>
+              <w:t>Valor contratado por departamento.</w:t>
+            </w:r>
+          </w:p>
+        </w:tc>
+        <w:tc>
+          <w:tcPr>
+            <w:tcW w:type="dxa" w:w="5953"/>
+          </w:tcPr>
+          <w:p>
+            <w:pPr>
+              <w:jc w:val="center"/>
+            </w:pPr>
+            <w:r>
+              <w:drawing>
+                <wp:inline xmlns:a="http://schemas.openxmlformats.org/drawingml/2006/main" xmlns:pic="http://schemas.openxmlformats.org/drawingml/2006/picture">
+                  <wp:extent cx="3240000" cy="1301690"/>
+                  <wp:docPr id="34738624" name="Picture 34738624"/>
+                  <wp:cNvGraphicFramePr>
+                    <a:graphicFrameLocks noChangeAspect="1"/>
+                  </wp:cNvGraphicFramePr>
+                  <a:graphic>
+                    <a:graphicData uri="http://schemas.openxmlformats.org/drawingml/2006/picture">
+                      <pic:pic>
+                        <pic:nvPicPr>
+                          <pic:cNvPr id="0" name="fig03_cell18.png"/>
+                          <pic:cNvPicPr/>
+                        </pic:nvPicPr>
+                        <pic:blipFill>
+                          <a:blip r:embed="rId13"/>
+                          <a:stretch>
+                            <a:fillRect/>
+                          </a:stretch>
+                        </pic:blipFill>
+                        <pic:spPr>
+                          <a:xfrm>
+                            <a:off x="0" y="0"/>
+                            <a:ext cx="3240000" cy="1301690"/>
+                          </a:xfrm>
+                          <a:prstGeom prst="rect"/>
+                        </pic:spPr>
+                      </pic:pic>
+                    </a:graphicData>
+                  </a:graphic>
+                </wp:inline>
+              </w:drawing>
+            </w:r>
+          </w:p>
+          <w:p>
+            <w:pPr>
+              <w:jc w:val="center"/>
+            </w:pPr>
+            <w:r>
+              <w:rPr>
+                <w:rFonts w:ascii="Cambria Math" w:hAnsi="Cambria Math"/>
+                <w:i/>
+                <w:sz w:val="18"/>
+              </w:rPr>
+              <w:t>Trazabilidad territorial por año.</w:t>
+            </w:r>
+          </w:p>
+        </w:tc>
+      </w:tr>
+    </w:tbl>
     <w:p>
       <w:pPr>
         <w:jc w:val="both"/>

</xml_diff>